<commit_message>
AI Use Declaration: add Kimi, Manus and the Gemini API
Kimi and Manus were used for initial research; the Gemini API key powers the
optional AI hypothesis feature.
</commit_message>
<xml_diff>
--- a/RELAY_AEGIS_AI_Use_Declaration.docx
+++ b/RELAY_AEGIS_AI_Use_Declaration.docx
@@ -41,14 +41,14 @@
         <w:tblLook w:firstColumn="1" w:firstRow="1" w:lastColumn="0" w:lastRow="0" w:noHBand="0" w:noVBand="1" w:val="04A0"/>
       </w:tblPr>
       <w:tblGrid>
-        <w:gridCol w:w="3456"/>
-        <w:gridCol w:w="3456"/>
-        <w:gridCol w:w="3456"/>
+        <w:gridCol w:w="2200"/>
+        <w:gridCol w:w="4160"/>
+        <w:gridCol w:w="4160"/>
       </w:tblGrid>
       <w:tr>
         <w:tc>
           <w:tcPr>
-            <w:tcW w:type="dxa" w:w="3456"/>
+            <w:tcW w:type="dxa" w:w="2200"/>
             <w:vAlign w:val="center"/>
           </w:tcPr>
           <w:p>
@@ -63,7 +63,7 @@
         </w:tc>
         <w:tc>
           <w:tcPr>
-            <w:tcW w:type="dxa" w:w="3456"/>
+            <w:tcW w:type="dxa" w:w="4160"/>
             <w:vAlign w:val="center"/>
           </w:tcPr>
           <w:p>
@@ -78,7 +78,7 @@
         </w:tc>
         <w:tc>
           <w:tcPr>
-            <w:tcW w:type="dxa" w:w="3456"/>
+            <w:tcW w:type="dxa" w:w="4160"/>
             <w:vAlign w:val="center"/>
           </w:tcPr>
           <w:p>
@@ -95,7 +95,60 @@
       <w:tr>
         <w:tc>
           <w:tcPr>
-            <w:tcW w:type="dxa" w:w="3456"/>
+            <w:tcW w:type="dxa" w:w="2200"/>
+            <w:vAlign w:val="top"/>
+          </w:tcPr>
+          <w:p>
+            <w:pPr>
+              <w:spacing w:after="40"/>
+            </w:pPr>
+            <w:r>
+              <w:rPr>
+                <w:sz w:val="19"/>
+              </w:rPr>
+              <w:t>Kimi and Manus</w:t>
+            </w:r>
+          </w:p>
+        </w:tc>
+        <w:tc>
+          <w:tcPr>
+            <w:tcW w:type="dxa" w:w="4160"/>
+            <w:vAlign w:val="top"/>
+          </w:tcPr>
+          <w:p>
+            <w:pPr>
+              <w:spacing w:after="40"/>
+            </w:pPr>
+            <w:r>
+              <w:rPr>
+                <w:sz w:val="19"/>
+              </w:rPr>
+              <w:t>Initial-level research: existing self-healing and incident-response approaches, failure types to test, and background reading for the problem definition.</w:t>
+            </w:r>
+          </w:p>
+        </w:tc>
+        <w:tc>
+          <w:tcPr>
+            <w:tcW w:type="dxa" w:w="4160"/>
+            <w:vAlign w:val="top"/>
+          </w:tcPr>
+          <w:p>
+            <w:pPr>
+              <w:spacing w:after="40"/>
+            </w:pPr>
+            <w:r>
+              <w:rPr>
+                <w:sz w:val="19"/>
+              </w:rPr>
+              <w:t>Compared the findings, chose the project scope and the failures to demonstrate, and cross-checked anything I used against official documentation.</w:t>
+            </w:r>
+          </w:p>
+        </w:tc>
+      </w:tr>
+      <w:tr>
+        <w:tc>
+          <w:tcPr>
+            <w:tcW w:type="dxa" w:w="2200"/>
             <w:vAlign w:val="top"/>
           </w:tcPr>
           <w:p>
@@ -112,7 +165,7 @@
         </w:tc>
         <w:tc>
           <w:tcPr>
-            <w:tcW w:type="dxa" w:w="3456"/>
+            <w:tcW w:type="dxa" w:w="4160"/>
             <w:vAlign w:val="top"/>
           </w:tcPr>
           <w:p>
@@ -129,7 +182,7 @@
         </w:tc>
         <w:tc>
           <w:tcPr>
-            <w:tcW w:type="dxa" w:w="3456"/>
+            <w:tcW w:type="dxa" w:w="4160"/>
             <w:vAlign w:val="top"/>
           </w:tcPr>
           <w:p>
@@ -148,7 +201,7 @@
       <w:tr>
         <w:tc>
           <w:tcPr>
-            <w:tcW w:type="dxa" w:w="3456"/>
+            <w:tcW w:type="dxa" w:w="2200"/>
             <w:vAlign w:val="top"/>
           </w:tcPr>
           <w:p>
@@ -165,7 +218,7 @@
         </w:tc>
         <w:tc>
           <w:tcPr>
-            <w:tcW w:type="dxa" w:w="3456"/>
+            <w:tcW w:type="dxa" w:w="4160"/>
             <w:vAlign w:val="top"/>
           </w:tcPr>
           <w:p>
@@ -182,7 +235,7 @@
         </w:tc>
         <w:tc>
           <w:tcPr>
-            <w:tcW w:type="dxa" w:w="3456"/>
+            <w:tcW w:type="dxa" w:w="4160"/>
             <w:vAlign w:val="top"/>
           </w:tcPr>
           <w:p>
@@ -201,7 +254,7 @@
       <w:tr>
         <w:tc>
           <w:tcPr>
-            <w:tcW w:type="dxa" w:w="3456"/>
+            <w:tcW w:type="dxa" w:w="2200"/>
             <w:vAlign w:val="top"/>
           </w:tcPr>
           <w:p>
@@ -212,13 +265,13 @@
               <w:rPr>
                 <w:sz w:val="19"/>
               </w:rPr>
-              <w:t>Gemini (Google)</w:t>
+              <w:t>Gemini (Google), incl. Gemini API</w:t>
             </w:r>
           </w:p>
         </w:tc>
         <w:tc>
           <w:tcPr>
-            <w:tcW w:type="dxa" w:w="3456"/>
+            <w:tcW w:type="dxa" w:w="4160"/>
             <w:vAlign w:val="top"/>
           </w:tcPr>
           <w:p>
@@ -229,13 +282,13 @@
               <w:rPr>
                 <w:sz w:val="19"/>
               </w:rPr>
-              <w:t>Help create and refine visual graphics for the project. Inside RELAY AEGIS itself, Gemini is an optional component that adds a clearly labelled AI hypothesis when an API key is set.</w:t>
+              <w:t>Help create and refine visual graphics for the project. The Gemini API (my own API key, kept only in the backend environment) powers RELAY's optional AI hypothesis feature.</w:t>
             </w:r>
           </w:p>
         </w:tc>
         <w:tc>
           <w:tcPr>
-            <w:tcW w:type="dxa" w:w="3456"/>
+            <w:tcW w:type="dxa" w:w="4160"/>
             <w:vAlign w:val="top"/>
           </w:tcPr>
           <w:p>
@@ -246,7 +299,7 @@
               <w:rPr>
                 <w:sz w:val="19"/>
               </w:rPr>
-              <w:t>Chose which graphics to use and where, checked them against the real system, and kept Gemini in the product advisory only: it never takes an action, authorises a recovery or marks anything resolved, and the deterministic engine works without it.</w:t>
+              <w:t>Chose which graphics to use and where, and checked them against the real system. Integrated the Gemini API myself and kept it advisory only: it never takes an action, authorises a recovery or marks anything resolved, and the deterministic engine works without it.</w:t>
             </w:r>
           </w:p>
         </w:tc>
@@ -254,7 +307,7 @@
       <w:tr>
         <w:tc>
           <w:tcPr>
-            <w:tcW w:type="dxa" w:w="3456"/>
+            <w:tcW w:type="dxa" w:w="2200"/>
             <w:vAlign w:val="top"/>
           </w:tcPr>
           <w:p>
@@ -271,7 +324,7 @@
         </w:tc>
         <w:tc>
           <w:tcPr>
-            <w:tcW w:type="dxa" w:w="3456"/>
+            <w:tcW w:type="dxa" w:w="4160"/>
             <w:vAlign w:val="top"/>
           </w:tcPr>
           <w:p>
@@ -288,7 +341,7 @@
         </w:tc>
         <w:tc>
           <w:tcPr>
-            <w:tcW w:type="dxa" w:w="3456"/>
+            <w:tcW w:type="dxa" w:w="4160"/>
             <w:vAlign w:val="top"/>
           </w:tcPr>
           <w:p>
@@ -307,7 +360,7 @@
       <w:tr>
         <w:tc>
           <w:tcPr>
-            <w:tcW w:type="dxa" w:w="3456"/>
+            <w:tcW w:type="dxa" w:w="2200"/>
             <w:vAlign w:val="top"/>
           </w:tcPr>
           <w:p>
@@ -324,7 +377,7 @@
         </w:tc>
         <w:tc>
           <w:tcPr>
-            <w:tcW w:type="dxa" w:w="3456"/>
+            <w:tcW w:type="dxa" w:w="4160"/>
             <w:vAlign w:val="top"/>
           </w:tcPr>
           <w:p>
@@ -341,7 +394,7 @@
         </w:tc>
         <w:tc>
           <w:tcPr>
-            <w:tcW w:type="dxa" w:w="3456"/>
+            <w:tcW w:type="dxa" w:w="4160"/>
             <w:vAlign w:val="top"/>
           </w:tcPr>
           <w:p>
@@ -418,7 +471,7 @@
     </w:p>
     <w:sectPr>
       <w:pgSz w:w="12240" w:h="15840"/>
-      <w:pgMar w:top="936" w:right="936" w:bottom="936" w:left="936" w:header="720" w:footer="720" w:gutter="0"/>
+      <w:pgMar w:top="680" w:right="860" w:bottom="620" w:left="860" w:header="720" w:footer="720" w:gutter="0"/>
       <w:cols w:space="720"/>
       <w:docGrid w:linePitch="360"/>
     </w:sectPr>

</xml_diff>